<commit_message>
Switch Bhopal LCZ paper to LCZ_Clipped.tif data
Replace the LCZ frequency report with the new 301 x 269 px clip (411.49 km2
valid, now matching the 10 m LULC layer to 0.03%). Raster size, extent and
background count are read from data/lcz_raster_meta.json instead of being
hard-coded; all statistics, tables, figures and text regenerated.

Co-Authored-By: Claude Opus 5.5 <noreply@anthropic.com>
Claude-Session: https://claude.ai/code/session_011DBRDAjGtWo3WiAb2bjNXx
</commit_message>
<xml_diff>
--- a/Bhopal_LCZ_Composition/Bhopal_LCZ_Composition_Paper_DRAFT.docx
+++ b/Bhopal_LCZ_Composition/Bhopal_LCZ_Composition_Paper_DRAFT.docx
@@ -128,7 +128,7 @@
           <w:sz w:val="22"/>
           <w:szCs w:val="22"/>
         </w:rPr>
-        <w:t xml:space="preserve">Local Climate Zone (LCZ) maps are increasingly used to describe the thermal relevance of urban form, yet most Indian applications report class maps without a quantitative account of how the LCZ mosaic is composed. This study extracts the LCZ structure of Bhopal, India, from the global 100 m LCZ map and evaluates it with areal, distributional and information-theoretic statistics. After reprojection to WGS 84 / UTM 43N (95.16 m pixels) and clipping to the study boundary, 13 of the 17 LCZ classes were detected over 419.04 km². Low plants (LCZ 14; 36.30%) and open low-rise (LCZ 6; 31.95%) dominate, and only 4 classes account for more than 80% of the mapped area. Built types (LCZ 1–10) occupy 53.58% and land-cover types 46.42%, while open built forms exceed compact forms by a factor of 3.58. Shannon entropy (H = 1.667 nats), evenness (J = 0.650), Gini–Simpson diversity (0.746) and a Gini coefficient of 0.688 indicate a moderately diverse but strongly dominance-skewed mosaic. Raster-code statistics (mean 9.95, median 9, SD 4.40 after excluding background) are reported transparently as descriptors of categorical codes. A cross-check against the independent 10 m Esri land-cover map of 2017 gives 85.4% proportional overlap of harmonised built, vegetated, bare and water groups (Jensen–Shannon divergence 0.025 bits), with the LCZ map assigning 11.9 percentage points more area to built types. The workflow is reproducible from open data and provides a statistical baseline for LCZ-based heat-risk planning in Bhopal.</w:t>
+        <w:t xml:space="preserve">Local Climate Zone (LCZ) maps are increasingly used to describe the thermal relevance of urban form, yet most Indian applications report class maps without a quantitative account of how the LCZ mosaic is composed. This study extracts the LCZ structure of Bhopal, India, from the global 100 m LCZ map and evaluates it with areal, distributional and information-theoretic statistics. After reprojection to WGS 84 / UTM 43N (95.16 m pixels) and clipping to the study boundary, 13 of the 17 LCZ classes were detected over 411.49 km². Low plants (LCZ 14; 35.61%) and open low-rise (LCZ 6; 32.44%) dominate, and only 4 classes account for more than 80% of the mapped area. Built types (LCZ 1–10) occupy 54.24% and land-cover types 45.76%, while open built forms exceed compact forms by a factor of 3.57. Shannon entropy (H = 1.669 nats), evenness (J = 0.651), Gini–Simpson diversity (0.747) and a Gini coefficient of 0.686 indicate a moderately diverse but strongly dominance-skewed mosaic. Raster-code statistics (mean 9.90, median 9, SD 4.41 after excluding background) are reported transparently as descriptors of categorical codes. A cross-check against the independent 10 m Esri land-cover map of 2017 gives 84.7% proportional overlap of harmonised built, vegetated, bare and water groups (Jensen–Shannon divergence 0.027 bits), with the LCZ map assigning 12.5 percentage points more area to built types. The workflow is reproducible from open data and provides a statistical baseline for LCZ-based heat-risk planning in Bhopal.</w:t>
       </w:r>
     </w:p>
     <w:p>
@@ -263,14 +263,14 @@
           <w:sz w:val="22"/>
           <w:szCs w:val="22"/>
         </w:rPr>
-        <w:t xml:space="preserve">Bhopal is the capital of Madhya Pradesh in central India and a tier-2 city with a composite climate (Mistry &amp; Mehrotra, 2026). Its urban form combines a dense historic core, planned residential sectors and institutional campuses with large lakes and a rapidly expanding peri-urban fringe. The analysis covers the study-area raster clipped to the Bhopal boundary in WGS 84 / UTM zone 43N (EPSG:32643), whose rectangular extent spans 731,025–759,763 m E and 2,557,268–2,583,437 m N (302 × 275 pixels; </w:t>
+        <w:t xml:space="preserve">Bhopal is the capital of Madhya Pradesh in central India and a tier-2 city with a composite climate (Mistry &amp; Mehrotra, 2026). Its urban form combines a dense historic core, planned residential sectors and institutional campuses with large lakes and a rapidly expanding peri-urban fringe. The analysis covers the study-area raster clipped to the Bhopal boundary in WGS 84 / UTM zone 43N (EPSG:32643), whose rectangular extent spans </w:t>
       </w:r>
       <w:r>
         <w:rPr>
           <w:sz w:val="22"/>
           <w:szCs w:val="22"/>
         </w:rPr>
-        <w:t xml:space="preserve">752.05 km²</w:t>
+        <w:t xml:space="preserve">731,111–759,754 m E and 2,557,602–2,583,200 m N (301 × 269 pixels; 733.20 km²</w:t>
       </w:r>
       <w:r>
         <w:rPr>
@@ -284,7 +284,7 @@
           <w:sz w:val="22"/>
           <w:szCs w:val="22"/>
         </w:rPr>
-        <w:t xml:space="preserve">419.04 km²</w:t>
+        <w:t xml:space="preserve">411.49 km²</w:t>
       </w:r>
       <w:r>
         <w:rPr>
@@ -298,7 +298,7 @@
           <w:sz w:val="22"/>
           <w:szCs w:val="22"/>
         </w:rPr>
-        <w:t xml:space="preserve">333.00 km²; 44.28%</w:t>
+        <w:t xml:space="preserve">321.71 km²; 43.88%</w:t>
       </w:r>
       <w:r>
         <w:rPr>
@@ -319,7 +319,7 @@
           <w:sz w:val="22"/>
           <w:szCs w:val="22"/>
         </w:rPr>
-        <w:t xml:space="preserve">The same boundary yields 411.3584 km² of valid pixels in the 10 m land-cover layer used for cross-checking (Section 3.7). The LCZ area is larger by 7.69 km² (1.87%), which is consistent with the coarser LCZ pixels overlapping the boundary line.</w:t>
+        <w:t xml:space="preserve">The same boundary yields 411.3584 km² of valid pixels in the 10 m land-cover layer used for cross-checking (Section 3.7). The two valid areas differ by only 0.13 km² (0.03%) despite a tenfold difference in pixel size, which confirms that both layers cover the same study area.</w:t>
       </w:r>
     </w:p>
     <w:p>
@@ -334,7 +334,7 @@
           <w:sz w:val="22"/>
           <w:szCs w:val="22"/>
         </w:rPr>
-        <w:t xml:space="preserve">[AUTHOR TO CONFIRM: give the official name and source of the boundary layer ('Reproject' in QGIS and GEE), and confirm that the 10 m LULC layer was clipped with the same boundary.]</w:t>
+        <w:t xml:space="preserve">[AUTHOR TO CONFIRM: give the official name and source of the boundary layer ('Reproject' in QGIS and GEE).]</w:t>
       </w:r>
     </w:p>
     <w:p>
@@ -2516,21 +2516,21 @@
           <w:sz w:val="22"/>
           <w:szCs w:val="22"/>
         </w:rPr>
-        <w:t xml:space="preserve">All statistics were computed with a Python script that reads only the QGIS frequency report. Three internal checks were passed: (i) the area column of the report equals pixel count × pixel area for every class; (ii) the total pixel count equals the raster dimensions (302 × 275 = 83,050); and (iii) the mean and SD computed from the frequency table including value 0 (</w:t>
+        <w:t xml:space="preserve">All statistics were computed with a Python script that reads only the QGIS frequency report. Two internal checks were passed: (i) the area column of the report equals pixel count × pixel area for every class; and (ii) the total pixel count equals the raster dimensions (</w:t>
       </w:r>
       <w:r>
         <w:rPr>
           <w:sz w:val="22"/>
           <w:szCs w:val="22"/>
         </w:rPr>
-        <w:t xml:space="preserve">5.54485 and 5.9331</w:t>
+        <w:t xml:space="preserve">301 × 269 = 80,969</w:t>
       </w:r>
       <w:r>
         <w:rPr>
           <w:sz w:val="22"/>
           <w:szCs w:val="22"/>
         </w:rPr>
-        <w:t xml:space="preserve">) reproduce the values reported by QGIS for the layer (5.54485 and 5.9331). The same checks were applied to the LULC layer, whose valid and NoData pixels (</w:t>
+        <w:t xml:space="preserve">). The same checks were applied to the LULC layer, whose valid and NoData pixels (</w:t>
       </w:r>
       <w:r>
         <w:rPr>
@@ -2636,7 +2636,7 @@
           <w:sz w:val="22"/>
           <w:szCs w:val="22"/>
         </w:rPr>
-        <w:t xml:space="preserve">Table 1 and Fig. 3b give the area of each class. Low plants (LCZ 14) form the largest class, with 152.11 km² (36.30%), followed by open low-rise (LCZ 6; 133.90 km², 31.95%). Together these two classes cover 68.25% of the mapped area. Compact low-rise (LCZ 3; 8.90%), sparsely built (LCZ 9; 8.00%), water (LCZ 17; 5.61%) and large low-rise (LCZ 8; 4.58%) form a middle tier, while the remaining seven classes each occupy less than 2.1%. Mid-rise forms are almost absent: compact mid-rise (LCZ 2) and open mid-rise (LCZ 5) together cover only 0.643 km².</w:t>
+        <w:t xml:space="preserve">Table 1 and Fig. 3b give the area of each class. Low plants (LCZ 14) form the largest class, with 146.55 km² (35.61%), followed by open low-rise (LCZ 6; 133.48 km², 32.44%). Together these two classes cover 68.05% of the mapped area. Compact low-rise (LCZ 3; 9.06%), sparsely built (LCZ 9; 7.94%), water (LCZ 17; 5.69%) and large low-rise (LCZ 8; 4.65%) form a middle tier, while the remaining seven classes each occupy less than 2.1%. Mid-rise forms are almost absent: compact mid-rise (LCZ 2) and open mid-rise (LCZ 5) together cover only 0.643 km².</w:t>
       </w:r>
     </w:p>
     <w:p>
@@ -3314,7 +3314,7 @@
                 <w:sz w:val="19"/>
                 <w:szCs w:val="19"/>
               </w:rPr>
-              <w:t xml:space="preserve">8.90</w:t>
+              <w:t xml:space="preserve">9.06</w:t>
             </w:r>
           </w:p>
         </w:tc>
@@ -3690,7 +3690,7 @@
                 <w:sz w:val="19"/>
                 <w:szCs w:val="19"/>
               </w:rPr>
-              <w:t xml:space="preserve">14,787</w:t>
+              <w:t xml:space="preserve">14,741</w:t>
             </w:r>
           </w:p>
         </w:tc>
@@ -3721,7 +3721,7 @@
                 <w:sz w:val="19"/>
                 <w:szCs w:val="19"/>
               </w:rPr>
-              <w:t xml:space="preserve">133.901</w:t>
+              <w:t xml:space="preserve">133.485</w:t>
             </w:r>
           </w:p>
         </w:tc>
@@ -3752,7 +3752,7 @@
                 <w:sz w:val="19"/>
                 <w:szCs w:val="19"/>
               </w:rPr>
-              <w:t xml:space="preserve">31.95</w:t>
+              <w:t xml:space="preserve">32.44</w:t>
             </w:r>
           </w:p>
         </w:tc>
@@ -3909,7 +3909,7 @@
                 <w:sz w:val="19"/>
                 <w:szCs w:val="19"/>
               </w:rPr>
-              <w:t xml:space="preserve">2,121</w:t>
+              <w:t xml:space="preserve">2,112</w:t>
             </w:r>
           </w:p>
         </w:tc>
@@ -3940,7 +3940,7 @@
                 <w:sz w:val="19"/>
                 <w:szCs w:val="19"/>
               </w:rPr>
-              <w:t xml:space="preserve">19.206</w:t>
+              <w:t xml:space="preserve">19.125</w:t>
             </w:r>
           </w:p>
         </w:tc>
@@ -3971,7 +3971,7 @@
                 <w:sz w:val="19"/>
                 <w:szCs w:val="19"/>
               </w:rPr>
-              <w:t xml:space="preserve">4.58</w:t>
+              <w:t xml:space="preserve">4.65</w:t>
             </w:r>
           </w:p>
         </w:tc>
@@ -4128,7 +4128,7 @@
                 <w:sz w:val="19"/>
                 <w:szCs w:val="19"/>
               </w:rPr>
-              <w:t xml:space="preserve">3,700</w:t>
+              <w:t xml:space="preserve">3,609</w:t>
             </w:r>
           </w:p>
         </w:tc>
@@ -4159,7 +4159,7 @@
                 <w:sz w:val="19"/>
                 <w:szCs w:val="19"/>
               </w:rPr>
-              <w:t xml:space="preserve">33.505</w:t>
+              <w:t xml:space="preserve">32.681</w:t>
             </w:r>
           </w:p>
         </w:tc>
@@ -4190,7 +4190,7 @@
                 <w:sz w:val="19"/>
                 <w:szCs w:val="19"/>
               </w:rPr>
-              <w:t xml:space="preserve">8.00</w:t>
+              <w:t xml:space="preserve">7.94</w:t>
             </w:r>
           </w:p>
         </w:tc>
@@ -4347,7 +4347,7 @@
                 <w:sz w:val="19"/>
                 <w:szCs w:val="19"/>
               </w:rPr>
-              <w:t xml:space="preserve">430</w:t>
+              <w:t xml:space="preserve">415</w:t>
             </w:r>
           </w:p>
         </w:tc>
@@ -4378,7 +4378,7 @@
                 <w:sz w:val="19"/>
                 <w:szCs w:val="19"/>
               </w:rPr>
-              <w:t xml:space="preserve">3.894</w:t>
+              <w:t xml:space="preserve">3.758</w:t>
             </w:r>
           </w:p>
         </w:tc>
@@ -4409,7 +4409,7 @@
                 <w:sz w:val="19"/>
                 <w:szCs w:val="19"/>
               </w:rPr>
-              <w:t xml:space="preserve">0.93</w:t>
+              <w:t xml:space="preserve">0.91</w:t>
             </w:r>
           </w:p>
         </w:tc>
@@ -4566,7 +4566,7 @@
                 <w:sz w:val="19"/>
                 <w:szCs w:val="19"/>
               </w:rPr>
-              <w:t xml:space="preserve">189</w:t>
+              <w:t xml:space="preserve">183</w:t>
             </w:r>
           </w:p>
         </w:tc>
@@ -4597,7 +4597,7 @@
                 <w:sz w:val="19"/>
                 <w:szCs w:val="19"/>
               </w:rPr>
-              <w:t xml:space="preserve">1.711</w:t>
+              <w:t xml:space="preserve">1.657</w:t>
             </w:r>
           </w:p>
         </w:tc>
@@ -4628,7 +4628,7 @@
                 <w:sz w:val="19"/>
                 <w:szCs w:val="19"/>
               </w:rPr>
-              <w:t xml:space="preserve">0.41</w:t>
+              <w:t xml:space="preserve">0.40</w:t>
             </w:r>
           </w:p>
         </w:tc>
@@ -4785,7 +4785,7 @@
                 <w:sz w:val="19"/>
                 <w:szCs w:val="19"/>
               </w:rPr>
-              <w:t xml:space="preserve">182</w:t>
+              <w:t xml:space="preserve">167</w:t>
             </w:r>
           </w:p>
         </w:tc>
@@ -4816,7 +4816,7 @@
                 <w:sz w:val="19"/>
                 <w:szCs w:val="19"/>
               </w:rPr>
-              <w:t xml:space="preserve">1.648</w:t>
+              <w:t xml:space="preserve">1.512</w:t>
             </w:r>
           </w:p>
         </w:tc>
@@ -4847,7 +4847,7 @@
                 <w:sz w:val="19"/>
                 <w:szCs w:val="19"/>
               </w:rPr>
-              <w:t xml:space="preserve">0.39</w:t>
+              <w:t xml:space="preserve">0.37</w:t>
             </w:r>
           </w:p>
         </w:tc>
@@ -5004,7 +5004,7 @@
                 <w:sz w:val="19"/>
                 <w:szCs w:val="19"/>
               </w:rPr>
-              <w:t xml:space="preserve">16,798</w:t>
+              <w:t xml:space="preserve">16,184</w:t>
             </w:r>
           </w:p>
         </w:tc>
@@ -5035,7 +5035,7 @@
                 <w:sz w:val="19"/>
                 <w:szCs w:val="19"/>
               </w:rPr>
-              <w:t xml:space="preserve">152.111</w:t>
+              <w:t xml:space="preserve">146.551</w:t>
             </w:r>
           </w:p>
         </w:tc>
@@ -5066,7 +5066,7 @@
                 <w:sz w:val="19"/>
                 <w:szCs w:val="19"/>
               </w:rPr>
-              <w:t xml:space="preserve">36.30</w:t>
+              <w:t xml:space="preserve">35.61</w:t>
             </w:r>
           </w:p>
         </w:tc>
@@ -5223,7 +5223,7 @@
                 <w:sz w:val="19"/>
                 <w:szCs w:val="19"/>
               </w:rPr>
-              <w:t xml:space="preserve">346</w:t>
+              <w:t xml:space="preserve">334</w:t>
             </w:r>
           </w:p>
         </w:tc>
@@ -5254,7 +5254,7 @@
                 <w:sz w:val="19"/>
                 <w:szCs w:val="19"/>
               </w:rPr>
-              <w:t xml:space="preserve">3.133</w:t>
+              <w:t xml:space="preserve">3.024</w:t>
             </w:r>
           </w:p>
         </w:tc>
@@ -5285,7 +5285,7 @@
                 <w:sz w:val="19"/>
                 <w:szCs w:val="19"/>
               </w:rPr>
-              <w:t xml:space="preserve">0.75</w:t>
+              <w:t xml:space="preserve">0.74</w:t>
             </w:r>
           </w:p>
         </w:tc>
@@ -5442,7 +5442,7 @@
                 <w:sz w:val="19"/>
                 <w:szCs w:val="19"/>
               </w:rPr>
-              <w:t xml:space="preserve">939</w:t>
+              <w:t xml:space="preserve">925</w:t>
             </w:r>
           </w:p>
         </w:tc>
@@ -5473,7 +5473,7 @@
                 <w:sz w:val="19"/>
                 <w:szCs w:val="19"/>
               </w:rPr>
-              <w:t xml:space="preserve">8.503</w:t>
+              <w:t xml:space="preserve">8.376</w:t>
             </w:r>
           </w:p>
         </w:tc>
@@ -5504,7 +5504,7 @@
                 <w:sz w:val="19"/>
                 <w:szCs w:val="19"/>
               </w:rPr>
-              <w:t xml:space="preserve">2.03</w:t>
+              <w:t xml:space="preserve">2.04</w:t>
             </w:r>
           </w:p>
         </w:tc>
@@ -5661,7 +5661,7 @@
                 <w:sz w:val="19"/>
                 <w:szCs w:val="19"/>
               </w:rPr>
-              <w:t xml:space="preserve">2,596</w:t>
+              <w:t xml:space="preserve">2,584</w:t>
             </w:r>
           </w:p>
         </w:tc>
@@ -5692,7 +5692,7 @@
                 <w:sz w:val="19"/>
                 <w:szCs w:val="19"/>
               </w:rPr>
-              <w:t xml:space="preserve">23.508</w:t>
+              <w:t xml:space="preserve">23.399</w:t>
             </w:r>
           </w:p>
         </w:tc>
@@ -5723,7 +5723,7 @@
                 <w:sz w:val="19"/>
                 <w:szCs w:val="19"/>
               </w:rPr>
-              <w:t xml:space="preserve">5.61</w:t>
+              <w:t xml:space="preserve">5.69</w:t>
             </w:r>
           </w:p>
         </w:tc>
@@ -5880,7 +5880,7 @@
                 <w:sz w:val="19"/>
                 <w:szCs w:val="19"/>
               </w:rPr>
-              <w:t xml:space="preserve">46,276</w:t>
+              <w:t xml:space="preserve">45,442</w:t>
             </w:r>
           </w:p>
         </w:tc>
@@ -5911,7 +5911,7 @@
                 <w:sz w:val="19"/>
                 <w:szCs w:val="19"/>
               </w:rPr>
-              <w:t xml:space="preserve">419.044</w:t>
+              <w:t xml:space="preserve">411.492</w:t>
             </w:r>
           </w:p>
         </w:tc>
@@ -6004,7 +6004,7 @@
           <w:sz w:val="22"/>
           <w:szCs w:val="22"/>
         </w:rPr>
-        <w:t xml:space="preserve">At the first level of aggregation, built LCZs cover 224.54 km² (53.58%) and land-cover LCZs 194.51 km² (46.42%), a built-to-land-cover ratio of 1.15 (Fig. 3d). Within the built fabric, open forms (LCZ 4–6; 134.31 km²) are 3.58 times as extensive as compact forms (LCZ 1–3; 37.52 km²), and the other built group, made up of large low-rise and sparsely built areas, adds 52.71 km². Among land-cover types, vegetated classes (159.36 km²) far exceed water (23.51 km²) and bare surfaces (11.64 km²). These proportions describe the composition of the classified map; they are not direct measurements of impervious-surface fraction.</w:t>
+        <w:t xml:space="preserve">At the first level of aggregation, built LCZs cover 223.21 km² (54.24%) and land-cover LCZs 188.28 km² (45.76%), a built-to-land-cover ratio of 1.19 (Fig. 3d). Within the built fabric, open forms (LCZ 4–6; 133.89 km²) are 3.57 times as extensive as compact forms (LCZ 1–3; 37.52 km²), and the other built group, made up of large low-rise and sparsely built areas, adds 51.81 km². Among land-cover types, vegetated classes (153.48 km²) far exceed water (23.40 km²) and bare surfaces (11.40 km²). These proportions describe the composition of the classified map; they are not direct measurements of impervious-surface fraction.</w:t>
       </w:r>
     </w:p>
     <w:p>
@@ -6104,7 +6104,7 @@
           <w:sz w:val="22"/>
           <w:szCs w:val="22"/>
         </w:rPr>
-        <w:t xml:space="preserve">Table 2 reports the raster-band statistics requested for a standard raster summary. Including background pixels, the mean code is 5.5449, the median 6 and the SD 5.9331; the mode is 0 because background is the single most frequent value. Excluding background, the mean rises to 9.9512, the median to 9, and the SD falls to 4.3964, while the mode becomes 14 (low plants). The gap between mean and median, and the bimodal frequency distribution in Fig. 4a with peaks at LCZ 6 and LCZ 14, show that the central-tendency statistics fall between two dominant classes rather than on a typical class. Excluding background is therefore essential, and even then the mean and SD summarise the position of the code distribution rather than any physical property of the city.</w:t>
+        <w:t xml:space="preserve">Table 2 reports the raster-band statistics requested for a standard raster summary. Including background pixels, the mean code is 5.5539, the median 6 and the SD 5.9166; the mode is 0 because background is the single most frequent value. Excluding background, the mean rises to 9.8961, the median to 9, and the SD falls to 4.4051, while the mode becomes 14 (low plants). The gap between mean and median, and the bimodal frequency distribution in Fig. 4a with peaks at LCZ 6 and LCZ 14, show that the central-tendency statistics fall between two dominant classes rather than on a typical class. Excluding background is therefore essential, and even then the mean and SD summarise the position of the code distribution rather than any physical property of the city.</w:t>
       </w:r>
     </w:p>
     <w:p>
@@ -6307,7 +6307,7 @@
                 <w:sz w:val="19"/>
                 <w:szCs w:val="19"/>
               </w:rPr>
-              <w:t xml:space="preserve">83,050</w:t>
+              <w:t xml:space="preserve">80,969</w:t>
             </w:r>
           </w:p>
         </w:tc>
@@ -6338,7 +6338,7 @@
                 <w:sz w:val="19"/>
                 <w:szCs w:val="19"/>
               </w:rPr>
-              <w:t xml:space="preserve">46,276</w:t>
+              <w:t xml:space="preserve">45,442</w:t>
             </w:r>
           </w:p>
         </w:tc>
@@ -6592,7 +6592,7 @@
                 <w:sz w:val="19"/>
                 <w:szCs w:val="19"/>
               </w:rPr>
-              <w:t xml:space="preserve">5.5449</w:t>
+              <w:t xml:space="preserve">5.5539</w:t>
             </w:r>
           </w:p>
         </w:tc>
@@ -6623,7 +6623,7 @@
                 <w:sz w:val="19"/>
                 <w:szCs w:val="19"/>
               </w:rPr>
-              <w:t xml:space="preserve">9.9512</w:t>
+              <w:t xml:space="preserve">9.8961</w:t>
             </w:r>
           </w:p>
         </w:tc>
@@ -6972,7 +6972,7 @@
                 <w:sz w:val="19"/>
                 <w:szCs w:val="19"/>
               </w:rPr>
-              <w:t xml:space="preserve">13</w:t>
+              <w:t xml:space="preserve">12</w:t>
             </w:r>
           </w:p>
         </w:tc>
@@ -7067,7 +7067,7 @@
                 <w:sz w:val="19"/>
                 <w:szCs w:val="19"/>
               </w:rPr>
-              <w:t xml:space="preserve">5.9331</w:t>
+              <w:t xml:space="preserve">5.9166</w:t>
             </w:r>
           </w:p>
         </w:tc>
@@ -7098,7 +7098,7 @@
                 <w:sz w:val="19"/>
                 <w:szCs w:val="19"/>
               </w:rPr>
-              <w:t xml:space="preserve">4.3964</w:t>
+              <w:t xml:space="preserve">4.4051</w:t>
             </w:r>
           </w:p>
         </w:tc>
@@ -7162,7 +7162,7 @@
                 <w:sz w:val="19"/>
                 <w:szCs w:val="19"/>
               </w:rPr>
-              <w:t xml:space="preserve">5.9332</w:t>
+              <w:t xml:space="preserve">5.9167</w:t>
             </w:r>
           </w:p>
         </w:tc>
@@ -7193,7 +7193,7 @@
                 <w:sz w:val="19"/>
                 <w:szCs w:val="19"/>
               </w:rPr>
-              <w:t xml:space="preserve">4.3964</w:t>
+              <w:t xml:space="preserve">4.4052</w:t>
             </w:r>
           </w:p>
         </w:tc>
@@ -7257,7 +7257,7 @@
                 <w:sz w:val="19"/>
                 <w:szCs w:val="19"/>
               </w:rPr>
-              <w:t xml:space="preserve">107.00</w:t>
+              <w:t xml:space="preserve">106.53</w:t>
             </w:r>
           </w:p>
         </w:tc>
@@ -7288,7 +7288,7 @@
                 <w:sz w:val="19"/>
                 <w:szCs w:val="19"/>
               </w:rPr>
-              <w:t xml:space="preserve">44.18</w:t>
+              <w:t xml:space="preserve">44.51</w:t>
             </w:r>
           </w:p>
         </w:tc>
@@ -7336,7 +7336,7 @@
           <w:sz w:val="22"/>
           <w:szCs w:val="22"/>
         </w:rPr>
-        <w:t xml:space="preserve">The class areas are strongly right-skewed (Table 3). The mean class area is 32.234 km² (7.69% of the mapped area), but the median is only 8.503 km² (2.03%), and the SD of 48.909 km² gives a coefficient of variation of 151.7%. The positive skewness (g1 = 1.702) confirms that a few large classes coexist with many small ones, so the median describes a typical class better than the mean.</w:t>
+        <w:t xml:space="preserve">The class areas are strongly right-skewed (Table 3). The mean class area is 31.653 km² (7.69% of the mapped area), but the median is only 8.376 km² (2.04%), and the SD of 47.830 km² gives a coefficient of variation of 151.1%. The positive skewness (g1 = 1.685) confirms that a few large classes coexist with many small ones, so the median describes a typical class better than the mean.</w:t>
       </w:r>
     </w:p>
     <w:p>
@@ -7634,7 +7634,7 @@
                 <w:sz w:val="19"/>
                 <w:szCs w:val="19"/>
               </w:rPr>
-              <w:t xml:space="preserve">32.234</w:t>
+              <w:t xml:space="preserve">31.653</w:t>
             </w:r>
           </w:p>
         </w:tc>
@@ -7729,7 +7729,7 @@
                 <w:sz w:val="19"/>
                 <w:szCs w:val="19"/>
               </w:rPr>
-              <w:t xml:space="preserve">8.503</w:t>
+              <w:t xml:space="preserve">8.376</w:t>
             </w:r>
           </w:p>
         </w:tc>
@@ -7760,7 +7760,7 @@
                 <w:sz w:val="19"/>
                 <w:szCs w:val="19"/>
               </w:rPr>
-              <w:t xml:space="preserve">2.029</w:t>
+              <w:t xml:space="preserve">2.036</w:t>
             </w:r>
           </w:p>
         </w:tc>
@@ -7824,7 +7824,7 @@
                 <w:sz w:val="19"/>
                 <w:szCs w:val="19"/>
               </w:rPr>
-              <w:t xml:space="preserve">48.909</w:t>
+              <w:t xml:space="preserve">47.830</w:t>
             </w:r>
           </w:p>
         </w:tc>
@@ -7855,7 +7855,7 @@
                 <w:sz w:val="19"/>
                 <w:szCs w:val="19"/>
               </w:rPr>
-              <w:t xml:space="preserve">11.672</w:t>
+              <w:t xml:space="preserve">11.624</w:t>
             </w:r>
           </w:p>
         </w:tc>
@@ -7919,7 +7919,7 @@
                 <w:sz w:val="19"/>
                 <w:szCs w:val="19"/>
               </w:rPr>
-              <w:t xml:space="preserve">50.906</w:t>
+              <w:t xml:space="preserve">49.783</w:t>
             </w:r>
           </w:p>
         </w:tc>
@@ -7950,7 +7950,7 @@
                 <w:sz w:val="19"/>
                 <w:szCs w:val="19"/>
               </w:rPr>
-              <w:t xml:space="preserve">12.148</w:t>
+              <w:t xml:space="preserve">12.098</w:t>
             </w:r>
           </w:p>
         </w:tc>
@@ -8014,7 +8014,7 @@
                 <w:sz w:val="19"/>
                 <w:szCs w:val="19"/>
               </w:rPr>
-              <w:t xml:space="preserve">151.7</w:t>
+              <w:t xml:space="preserve">151.1</w:t>
             </w:r>
           </w:p>
         </w:tc>
@@ -8045,7 +8045,7 @@
                 <w:sz w:val="19"/>
                 <w:szCs w:val="19"/>
               </w:rPr>
-              <w:t xml:space="preserve">151.7</w:t>
+              <w:t xml:space="preserve">151.1</w:t>
             </w:r>
           </w:p>
         </w:tc>
@@ -8140,7 +8140,7 @@
                 <w:sz w:val="19"/>
                 <w:szCs w:val="19"/>
               </w:rPr>
-              <w:t xml:space="preserve">0.056</w:t>
+              <w:t xml:space="preserve">0.057</w:t>
             </w:r>
           </w:p>
         </w:tc>
@@ -8204,7 +8204,7 @@
                 <w:sz w:val="19"/>
                 <w:szCs w:val="19"/>
               </w:rPr>
-              <w:t xml:space="preserve">1.711</w:t>
+              <w:t xml:space="preserve">1.657</w:t>
             </w:r>
           </w:p>
         </w:tc>
@@ -8235,7 +8235,7 @@
                 <w:sz w:val="19"/>
                 <w:szCs w:val="19"/>
               </w:rPr>
-              <w:t xml:space="preserve">0.408</w:t>
+              <w:t xml:space="preserve">0.403</w:t>
             </w:r>
           </w:p>
         </w:tc>
@@ -8299,7 +8299,7 @@
                 <w:sz w:val="19"/>
                 <w:szCs w:val="19"/>
               </w:rPr>
-              <w:t xml:space="preserve">33.505</w:t>
+              <w:t xml:space="preserve">32.681</w:t>
             </w:r>
           </w:p>
         </w:tc>
@@ -8330,7 +8330,7 @@
                 <w:sz w:val="19"/>
                 <w:szCs w:val="19"/>
               </w:rPr>
-              <w:t xml:space="preserve">7.996</w:t>
+              <w:t xml:space="preserve">7.942</w:t>
             </w:r>
           </w:p>
         </w:tc>
@@ -8394,7 +8394,7 @@
                 <w:sz w:val="19"/>
                 <w:szCs w:val="19"/>
               </w:rPr>
-              <w:t xml:space="preserve">152.111</w:t>
+              <w:t xml:space="preserve">146.551</w:t>
             </w:r>
           </w:p>
         </w:tc>
@@ -8425,7 +8425,7 @@
                 <w:sz w:val="19"/>
                 <w:szCs w:val="19"/>
               </w:rPr>
-              <w:t xml:space="preserve">36.300</w:t>
+              <w:t xml:space="preserve">35.615</w:t>
             </w:r>
           </w:p>
         </w:tc>
@@ -8489,7 +8489,7 @@
                 <w:sz w:val="19"/>
                 <w:szCs w:val="19"/>
               </w:rPr>
-              <w:t xml:space="preserve">1.702</w:t>
+              <w:t xml:space="preserve">1.685</w:t>
             </w:r>
           </w:p>
         </w:tc>
@@ -8520,7 +8520,7 @@
                 <w:sz w:val="19"/>
                 <w:szCs w:val="19"/>
               </w:rPr>
-              <w:t xml:space="preserve">1.702</w:t>
+              <w:t xml:space="preserve">1.685</w:t>
             </w:r>
           </w:p>
         </w:tc>
@@ -8584,7 +8584,7 @@
                 <w:sz w:val="19"/>
                 <w:szCs w:val="19"/>
               </w:rPr>
-              <w:t xml:space="preserve">419.044</w:t>
+              <w:t xml:space="preserve">411.492</w:t>
             </w:r>
           </w:p>
         </w:tc>
@@ -8663,7 +8663,7 @@
           <w:sz w:val="22"/>
           <w:szCs w:val="22"/>
         </w:rPr>
-        <w:t xml:space="preserve">Shannon entropy of the LCZ mosaic is 1.6669 nats, against a maximum of 2.5649 for 13 equally abundant classes, giving an evenness of 0.650 (0.588 relative to the full 17-class scheme; Table 4, Fig. 4c). The Gini–Simpson index (0.746) implies that two randomly chosen pixels belong to different classes in about three of four cases, yet the effective number of classes is only 5.30 (Hill N1) or 3.94 (inverse Simpson), well below the 13 classes present. Dominance is high: the Berger–Parker index shows that one class (LCZ 14) holds 36.3% of the area, the Gini coefficient of class areas is 0.688, and the rank–dominance curve (Fig. 3c) crosses 80% at only 4 classes. Entropy is higher within the built classes (H = 1.119) than within the land-cover classes (H = 0.811), meaning that the built fabric is more internally differentiated than the surrounding land cover, which is dominated by low plants.</w:t>
+        <w:t xml:space="preserve">Shannon entropy of the LCZ mosaic is 1.6695 nats, against a maximum of 2.5649 for 13 equally abundant classes, giving an evenness of 0.651 (0.589 relative to the full 17-class scheme; Table 4, Fig. 4c). The Gini–Simpson index (0.747) implies that two randomly chosen pixels belong to different classes in about three of four cases, yet the effective number of classes is only 5.31 (Hill N1) or 3.96 (inverse Simpson), well below the 13 classes present. Dominance is high: the Berger–Parker index shows that one class (LCZ 14) holds 35.6% of the area, the Gini coefficient of class areas is 0.686, and the rank–dominance curve (Fig. 3c) crosses 80% at only 4 classes. Entropy is higher within the built classes (H = 1.117) than within the land-cover classes (H = 0.818), meaning that the built fabric is more internally differentiated than the surrounding land cover, which is dominated by low plants.</w:t>
       </w:r>
     </w:p>
     <w:p>
@@ -8866,7 +8866,7 @@
                 <w:sz w:val="19"/>
                 <w:szCs w:val="19"/>
               </w:rPr>
-              <w:t xml:space="preserve">1.6669</w:t>
+              <w:t xml:space="preserve">1.6695</w:t>
             </w:r>
           </w:p>
         </w:tc>
@@ -8961,7 +8961,7 @@
                 <w:sz w:val="19"/>
                 <w:szCs w:val="19"/>
               </w:rPr>
-              <w:t xml:space="preserve">0.6499</w:t>
+              <w:t xml:space="preserve">0.6509</w:t>
             </w:r>
           </w:p>
         </w:tc>
@@ -9056,7 +9056,7 @@
                 <w:sz w:val="19"/>
                 <w:szCs w:val="19"/>
               </w:rPr>
-              <w:t xml:space="preserve">0.5883</w:t>
+              <w:t xml:space="preserve">0.5893</w:t>
             </w:r>
           </w:p>
         </w:tc>
@@ -9151,7 +9151,7 @@
                 <w:sz w:val="19"/>
                 <w:szCs w:val="19"/>
               </w:rPr>
-              <w:t xml:space="preserve">0.7460</w:t>
+              <w:t xml:space="preserve">0.7474</w:t>
             </w:r>
           </w:p>
         </w:tc>
@@ -9246,7 +9246,7 @@
                 <w:sz w:val="19"/>
                 <w:szCs w:val="19"/>
               </w:rPr>
-              <w:t xml:space="preserve">3.937</w:t>
+              <w:t xml:space="preserve">3.959</w:t>
             </w:r>
           </w:p>
         </w:tc>
@@ -9341,7 +9341,7 @@
                 <w:sz w:val="19"/>
                 <w:szCs w:val="19"/>
               </w:rPr>
-              <w:t xml:space="preserve">5.296</w:t>
+              <w:t xml:space="preserve">5.309</w:t>
             </w:r>
           </w:p>
         </w:tc>
@@ -9436,7 +9436,7 @@
                 <w:sz w:val="19"/>
                 <w:szCs w:val="19"/>
               </w:rPr>
-              <w:t xml:space="preserve">0.3630</w:t>
+              <w:t xml:space="preserve">0.3561</w:t>
             </w:r>
           </w:p>
         </w:tc>
@@ -9531,7 +9531,7 @@
                 <w:sz w:val="19"/>
                 <w:szCs w:val="19"/>
               </w:rPr>
-              <w:t xml:space="preserve">0.6875</w:t>
+              <w:t xml:space="preserve">0.6863</w:t>
             </w:r>
           </w:p>
         </w:tc>
@@ -9721,7 +9721,7 @@
                 <w:sz w:val="19"/>
                 <w:szCs w:val="19"/>
               </w:rPr>
-              <w:t xml:space="preserve">1.1192</w:t>
+              <w:t xml:space="preserve">1.1169</w:t>
             </w:r>
           </w:p>
         </w:tc>
@@ -9816,7 +9816,7 @@
                 <w:sz w:val="19"/>
                 <w:szCs w:val="19"/>
               </w:rPr>
-              <w:t xml:space="preserve">0.8114</w:t>
+              <w:t xml:space="preserve">0.8175</w:t>
             </w:r>
           </w:p>
         </w:tc>
@@ -9964,7 +9964,7 @@
           <w:sz w:val="22"/>
           <w:szCs w:val="22"/>
         </w:rPr>
-        <w:t xml:space="preserve">The 10 m LULC layer covers a rectangle of 726.75 km², of which 411.3584 km² (56.60%) is valid and 315.3916 km² is NoData outside the boundary. Each pixel represents 100 m² (Eq. 1 with Δx = Δy = 10 m). Built area (171.57 km²; 41.71%) and crops (164.22 km²; 39.92%) together cover 81.63% of the city, followed by rangeland (8.53%) and water (6.90%; Table 5, Fig. 5a). The class codes have a mean of 6.0001, a median of 7 and an SD of 2.2466 (Table 6). As for the LCZ raster, these values summarise categorical codes only. The class areas are again right-skewed (mean 58.77 km², median 28.40 km²), and the LULC mosaic is less diverse than the LCZ mosaic (H = 1.249 vs 1.667; Fig. 5c–d) because its legend has fewer classes. Its evenness (J = 0.642) is, however, almost identical to that of the LCZ map (0.650).</w:t>
+        <w:t xml:space="preserve">The 10 m LULC layer covers a rectangle of 726.75 km², of which 411.3584 km² (56.60%) is valid and 315.3916 km² is NoData outside the boundary. Each pixel represents 100 m² (Eq. 1 with Δx = Δy = 10 m). Built area (171.57 km²; 41.71%) and crops (164.22 km²; 39.92%) together cover 81.63% of the city, followed by rangeland (8.53%) and water (6.90%; Table 5, Fig. 5a). The class codes have a mean of 6.0001, a median of 7 and an SD of 2.2466 (Table 6). As for the LCZ raster, these values summarise categorical codes only. The class areas are again right-skewed (mean 58.77 km², median 28.40 km²), and the LULC mosaic is less diverse than the LCZ mosaic (H = 1.249 vs 1.669; Fig. 5c–d) because its legend has fewer classes. Its evenness (J = 0.642) is, however, almost identical to that of the LCZ map (0.651).</w:t>
       </w:r>
     </w:p>
     <w:p>
@@ -12674,7 +12674,7 @@
           <w:sz w:val="22"/>
           <w:szCs w:val="22"/>
         </w:rPr>
-        <w:t xml:space="preserve">After harmonisation, the two layers share 85.4% of their composition, and the Jensen–Shannon divergence is only 0.025 bits (Table 7, Fig. 5b). Water agrees most closely (5.61% vs 6.90%). The largest difference is that the LCZ map assigns 11.88 percentage points more of the city to built types and correspondingly less to vegetated types (13.31 points). Bare surfaces cover 2.78% in the LCZ map but only 0.05% in the LULC map.</w:t>
+        <w:t xml:space="preserve">After harmonisation, the two layers share 84.7% of their composition, and the Jensen–Shannon divergence is only 0.027 bits (Table 7, Fig. 5b). Water agrees most closely (5.69% vs 6.90%). The largest difference is that the LCZ map assigns 12.54 percentage points more of the city to built types and correspondingly less to vegetated types (14.04 points). Bare surfaces cover 2.77% in the LCZ map but only 0.05% in the LULC map.</w:t>
       </w:r>
     </w:p>
     <w:p>
@@ -13104,7 +13104,7 @@
                 <w:sz w:val="19"/>
                 <w:szCs w:val="19"/>
               </w:rPr>
-              <w:t xml:space="preserve">224.536</w:t>
+              <w:t xml:space="preserve">223.214</w:t>
             </w:r>
           </w:p>
         </w:tc>
@@ -13166,7 +13166,7 @@
                 <w:sz w:val="19"/>
                 <w:szCs w:val="19"/>
               </w:rPr>
-              <w:t xml:space="preserve">53.58</w:t>
+              <w:t xml:space="preserve">54.24</w:t>
             </w:r>
           </w:p>
         </w:tc>
@@ -13228,7 +13228,7 @@
                 <w:sz w:val="19"/>
                 <w:szCs w:val="19"/>
               </w:rPr>
-              <w:t xml:space="preserve">+11.88</w:t>
+              <w:t xml:space="preserve">+12.54</w:t>
             </w:r>
           </w:p>
         </w:tc>
@@ -13354,7 +13354,7 @@
                 <w:sz w:val="19"/>
                 <w:szCs w:val="19"/>
               </w:rPr>
-              <w:t xml:space="preserve">159.365</w:t>
+              <w:t xml:space="preserve">153.479</w:t>
             </w:r>
           </w:p>
         </w:tc>
@@ -13416,7 +13416,7 @@
                 <w:sz w:val="19"/>
                 <w:szCs w:val="19"/>
               </w:rPr>
-              <w:t xml:space="preserve">38.03</w:t>
+              <w:t xml:space="preserve">37.30</w:t>
             </w:r>
           </w:p>
         </w:tc>
@@ -13478,7 +13478,7 @@
                 <w:sz w:val="19"/>
                 <w:szCs w:val="19"/>
               </w:rPr>
-              <w:t xml:space="preserve">−13.31</w:t>
+              <w:t xml:space="preserve">−14.04</w:t>
             </w:r>
           </w:p>
         </w:tc>
@@ -13604,7 +13604,7 @@
                 <w:sz w:val="19"/>
                 <w:szCs w:val="19"/>
               </w:rPr>
-              <w:t xml:space="preserve">11.636</w:t>
+              <w:t xml:space="preserve">11.401</w:t>
             </w:r>
           </w:p>
         </w:tc>
@@ -13666,7 +13666,7 @@
                 <w:sz w:val="19"/>
                 <w:szCs w:val="19"/>
               </w:rPr>
-              <w:t xml:space="preserve">2.78</w:t>
+              <w:t xml:space="preserve">2.77</w:t>
             </w:r>
           </w:p>
         </w:tc>
@@ -13854,7 +13854,7 @@
                 <w:sz w:val="19"/>
                 <w:szCs w:val="19"/>
               </w:rPr>
-              <w:t xml:space="preserve">23.508</w:t>
+              <w:t xml:space="preserve">23.399</w:t>
             </w:r>
           </w:p>
         </w:tc>
@@ -13916,7 +13916,7 @@
                 <w:sz w:val="19"/>
                 <w:szCs w:val="19"/>
               </w:rPr>
-              <w:t xml:space="preserve">5.61</w:t>
+              <w:t xml:space="preserve">5.69</w:t>
             </w:r>
           </w:p>
         </w:tc>
@@ -13978,7 +13978,7 @@
                 <w:sz w:val="19"/>
                 <w:szCs w:val="19"/>
               </w:rPr>
-              <w:t xml:space="preserve">−1.29</w:t>
+              <w:t xml:space="preserve">−1.22</w:t>
             </w:r>
           </w:p>
         </w:tc>
@@ -13995,7 +13995,7 @@
           <w:sz w:val="18"/>
           <w:szCs w:val="18"/>
         </w:rPr>
-        <w:t xml:space="preserve">Note: Δ = LCZ share − LULC share in percentage points. Overlap O = 0.8540; JSD = 0.0253 bits. Source: own calculation.</w:t>
+        <w:t xml:space="preserve">Note: Δ = LCZ share − LULC share in percentage points. Overlap O = 0.8474; JSD = 0.0266 bits. Source: own calculation.</w:t>
       </w:r>
     </w:p>
     <w:p>
@@ -14107,7 +14107,7 @@
           <w:sz w:val="22"/>
           <w:szCs w:val="22"/>
         </w:rPr>
-        <w:t xml:space="preserve">The composition indices add information that a class map cannot convey. A Gini–Simpson value of 0.75 on its own would suggest a diverse city, but the effective number of classes (about 5) and the Berger–Parker value show that this diversity is concentrated in a small number of dominant zones. For heat-risk planning this matters, because intervention priorities are set by the zones that cover most of the city. Mistry and Mehrotra (2025a) found the highest surface temperatures in Bhopal in compact low-rise LCZ 3, which covers 8.9% of the area here. LCZ 3 is therefore a spatially limited but thermally critical class, whereas LCZ 6 combines a large area with moderate density and is the class where cumulative gains from greening and cool-surface measures would be largest.</w:t>
+        <w:t xml:space="preserve">The composition indices add information that a class map cannot convey. A Gini–Simpson value of 0.75 on its own would suggest a diverse city, but the effective number of classes (about 5) and the Berger–Parker value show that this diversity is concentrated in a small number of dominant zones. For heat-risk planning this matters, because intervention priorities are set by the zones that cover most of the city. Mistry and Mehrotra (2025a) found the highest surface temperatures in Bhopal in compact low-rise LCZ 3, which covers 9.1% of the area here. LCZ 3 is therefore a spatially limited but thermally critical class, whereas LCZ 6 combines a large area with moderate density and is the class where cumulative gains from greening and cool-surface measures would be largest.</w:t>
       </w:r>
     </w:p>
     <w:p>
@@ -14121,7 +14121,7 @@
           <w:sz w:val="22"/>
           <w:szCs w:val="22"/>
         </w:rPr>
-        <w:t xml:space="preserve">Water (LCZ 17; 5.61%) and dense or scattered trees (LCZ 11–12) are small in area but important for the city's thermal regulation. In Bhopal, the water LCZ was reported to be 3–5 °C cooler than other classes (Mistry &amp; Mehrotra, 2023), and major water bodies produce measurable cooling over distances of several kilometres (Dwivedi &amp; Soni, 2026). The dominance of low plants (LCZ 14) at the urban fringe is consistent with the warmer rural surfaces that create Bhopal's daytime surface cool island (Mistry &amp; Mehrotra, 2023; Mistry &amp; Mehrotra, 2026), since bare and sparsely vegetated agricultural land heats strongly before the monsoon. At the national scale, open mid-rise (LCZ 5) was the hottest built class across major metropolitan cities (Saxena &amp; Agrawal, 2023). Its near-absence in Bhopal suggests that the thermal hierarchy of LCZs in tier-2 cities may differ from that of the metros and should be tested locally.</w:t>
+        <w:t xml:space="preserve">Water (LCZ 17; 5.69%) and dense or scattered trees (LCZ 11–12) are small in area but important for the city's thermal regulation. In Bhopal, the water LCZ was reported to be 3–5 °C cooler than other classes (Mistry &amp; Mehrotra, 2023), and major water bodies produce measurable cooling over distances of several kilometres (Dwivedi &amp; Soni, 2026). The dominance of low plants (LCZ 14) at the urban fringe is consistent with the warmer rural surfaces that create Bhopal's daytime surface cool island (Mistry &amp; Mehrotra, 2023; Mistry &amp; Mehrotra, 2026), since bare and sparsely vegetated agricultural land heats strongly before the monsoon. At the national scale, open mid-rise (LCZ 5) was the hottest built class across major metropolitan cities (Saxena &amp; Agrawal, 2023). Its near-absence in Bhopal suggests that the thermal hierarchy of LCZs in tier-2 cities may differ from that of the metros and should be tested locally.</w:t>
       </w:r>
     </w:p>
     <w:p>
@@ -14149,7 +14149,7 @@
           <w:sz w:val="22"/>
           <w:szCs w:val="22"/>
         </w:rPr>
-        <w:t xml:space="preserve">The cross-check supports the LCZ composition while showing where the two systems diverge by design. LCZ built classes describe whole neighbourhoods at the local scale and therefore include their gardens, trees and open ground (Stewart &amp; Oke, 2012), whereas the 10 m built-area class labels individual built-up pixels (Karra et al., 2021). The 11.9-point excess of built area in the LCZ map is therefore expected, and it most plausibly comes from open low-rise and sparsely built zones (LCZ 6 and 9), which by definition contain substantial pervious cover. The bare-surface discrepancy follows from the legends: LCZ 15 includes paved surfaces, which the land-cover map counts as built area, and seasonally bare fields may appear as crops in an annual land-cover composite. The close agreement for water, the class whose definition is most similar in both systems, together with an overlap of 85.4%, indicates that the global LCZ map gives a credible picture of Bhopal's broad surface composition.</w:t>
+        <w:t xml:space="preserve">The cross-check supports the LCZ composition while showing where the two systems diverge by design. LCZ built classes describe whole neighbourhoods at the local scale and therefore include their gardens, trees and open ground (Stewart &amp; Oke, 2012), whereas the 10 m built-area class labels individual built-up pixels (Karra et al., 2021). The 12.5-point excess of built area in the LCZ map is therefore expected, and it most plausibly comes from open low-rise and sparsely built zones (LCZ 6 and 9), which by definition contain substantial pervious cover. The bare-surface discrepancy follows from the legends: LCZ 15 includes paved surfaces, which the land-cover map counts as built area, and seasonally bare fields may appear as crops in an annual land-cover composite. The close agreement for water, the class whose definition is most similar in both systems, together with an overlap of 84.7%, indicates that the global LCZ map gives a credible picture of Bhopal's broad surface composition.</w:t>
       </w:r>
     </w:p>
     <w:p>
@@ -14209,7 +14209,7 @@
           <w:sz w:val="22"/>
           <w:szCs w:val="22"/>
         </w:rPr>
-        <w:t xml:space="preserve">This study provides the first quantitative compositional account of Local Climate Zones in Bhopal based on the standardised global 100 m LCZ map. Thirteen of the 17 LCZ classes were detected over 419.04 km². Low plants and open low-rise dominate, together covering 68.3% of the area, and built types slightly exceed land-cover types (53.6% vs 46.4%). Shannon entropy of 1.667 nats, an evenness of 0.650 and a Gini coefficient of 0.688 describe a moderately diverse but strongly dominance-skewed mosaic in which four classes cover more than 80% of the city. Raster-code statistics are reported both with and without background and are explicitly limited to the code distribution. An independent 10 m land-cover map of 2017 reproduces 85.4% of the harmonised LCZ composition, with the expected surplus of built area in the neighbourhood-scale LCZ scheme. The reproducible workflow and the verified statistics provide a baseline for future work linking LCZ composition to land surface temperature, validating the global map with local reference data and tracking LCZ change in Bhopal over time.</w:t>
+        <w:t xml:space="preserve">This study provides the first quantitative compositional account of Local Climate Zones in Bhopal based on the standardised global 100 m LCZ map. Thirteen of the 17 LCZ classes were detected over 411.49 km². Low plants and open low-rise dominate, together covering 68.1% of the area, and built types slightly exceed land-cover types (54.2% vs 45.8%). Shannon entropy of 1.669 nats, an evenness of 0.651 and a Gini coefficient of 0.686 describe a moderately diverse but strongly dominance-skewed mosaic in which four classes cover more than 80% of the city. Raster-code statistics are reported both with and without background and are explicitly limited to the code distribution. An independent 10 m land-cover map of 2017 reproduces 84.7% of the harmonised LCZ composition, with the expected surplus of built area in the neighbourhood-scale LCZ scheme. The reproducible workflow and the verified statistics provide a baseline for future work linking LCZ composition to land surface temperature, validating the global map with local reference data and tracking LCZ change in Bhopal over time.</w:t>
       </w:r>
     </w:p>
     <w:p>

</xml_diff>